<commit_message>
Updated Week_02 Questions up to Question 21
</commit_message>
<xml_diff>
--- a/week_02/Week2.docx
+++ b/week_02/Week2.docx
@@ -102,10 +102,10 @@
         <mc:AlternateContent>
           <mc:Choice Requires="wpg">
             <w:drawing>
-              <wp:inline distT="0" distB="0" distL="0" distR="0" wp14:anchorId="34B9B404" wp14:editId="533BC861">
+              <wp:inline distT="0" distB="0" distL="0" distR="0" wp14:anchorId="36CE00FC" wp14:editId="18089DEA">
                 <wp:extent cx="5945885" cy="20955"/>
                 <wp:effectExtent l="0" t="0" r="0" b="0"/>
-                <wp:docPr id="6090" name="Group 6090"/>
+                <wp:docPr id="5221" name="Group 5221"/>
                 <wp:cNvGraphicFramePr/>
                 <a:graphic xmlns:a="http://schemas.openxmlformats.org/drawingml/2006/main">
                   <a:graphicData uri="http://schemas.microsoft.com/office/word/2010/wordprocessingGroup">
@@ -613,7 +613,7 @@
           </mc:Choice>
           <mc:Fallback xmlns:a="http://schemas.openxmlformats.org/drawingml/2006/main">
             <w:pict>
-              <v:group id="Group 6090" style="width:468.18pt;height:1.64996pt;mso-position-horizontal-relative:char;mso-position-vertical-relative:line" coordsize="59458,209">
+              <v:group id="Group 5221" style="width:468.18pt;height:1.64996pt;mso-position-horizontal-relative:char;mso-position-vertical-relative:line" coordsize="59458,209">
                 <v:shape id="Shape 6767" style="position:absolute;width:59436;height:203;left:0;top:0;" coordsize="5943600,20320" path="m0,0l5943600,0l5943600,20320l0,20320l0,0">
                   <v:stroke weight="0pt" endcap="flat" joinstyle="miter" miterlimit="10" on="false" color="#000000" opacity="0"/>
                   <v:fill on="true" color="#a0a0a0"/>
@@ -759,10 +759,10 @@
         <mc:AlternateContent>
           <mc:Choice Requires="wpg">
             <w:drawing>
-              <wp:inline distT="0" distB="0" distL="0" distR="0" wp14:anchorId="378323A8" wp14:editId="3CFBA585">
+              <wp:inline distT="0" distB="0" distL="0" distR="0" wp14:anchorId="1D9ECFBC" wp14:editId="70941BD6">
                 <wp:extent cx="5945885" cy="21590"/>
                 <wp:effectExtent l="0" t="0" r="0" b="0"/>
-                <wp:docPr id="6091" name="Group 6091"/>
+                <wp:docPr id="5222" name="Group 5222"/>
                 <wp:cNvGraphicFramePr/>
                 <a:graphic xmlns:a="http://schemas.openxmlformats.org/drawingml/2006/main">
                   <a:graphicData uri="http://schemas.microsoft.com/office/word/2010/wordprocessingGroup">
@@ -1270,7 +1270,7 @@
           </mc:Choice>
           <mc:Fallback xmlns:a="http://schemas.openxmlformats.org/drawingml/2006/main">
             <w:pict>
-              <v:group id="Group 6091" style="width:468.18pt;height:1.70001pt;mso-position-horizontal-relative:char;mso-position-vertical-relative:line" coordsize="59458,215">
+              <v:group id="Group 5222" style="width:468.18pt;height:1.70001pt;mso-position-horizontal-relative:char;mso-position-vertical-relative:line" coordsize="59458,215">
                 <v:shape id="Shape 6787" style="position:absolute;width:59436;height:203;left:0;top:0;" coordsize="5943600,20320" path="m0,0l5943600,0l5943600,20320l0,20320l0,0">
                   <v:stroke weight="0pt" endcap="flat" joinstyle="miter" miterlimit="10" on="false" color="#000000" opacity="0"/>
                   <v:fill on="true" color="#a0a0a0"/>
@@ -1413,10 +1413,10 @@
         <mc:AlternateContent>
           <mc:Choice Requires="wpg">
             <w:drawing>
-              <wp:inline distT="0" distB="0" distL="0" distR="0" wp14:anchorId="1D09AFB8" wp14:editId="17A6D580">
+              <wp:inline distT="0" distB="0" distL="0" distR="0" wp14:anchorId="7CFCD7F3" wp14:editId="0AF5852F">
                 <wp:extent cx="5945885" cy="21972"/>
                 <wp:effectExtent l="0" t="0" r="0" b="0"/>
-                <wp:docPr id="6092" name="Group 6092"/>
+                <wp:docPr id="5223" name="Group 5223"/>
                 <wp:cNvGraphicFramePr/>
                 <a:graphic xmlns:a="http://schemas.openxmlformats.org/drawingml/2006/main">
                   <a:graphicData uri="http://schemas.microsoft.com/office/word/2010/wordprocessingGroup">
@@ -1924,7 +1924,7 @@
           </mc:Choice>
           <mc:Fallback xmlns:a="http://schemas.openxmlformats.org/drawingml/2006/main">
             <w:pict>
-              <v:group id="Group 6092" style="width:468.18pt;height:1.73004pt;mso-position-horizontal-relative:char;mso-position-vertical-relative:line" coordsize="59458,219">
+              <v:group id="Group 5223" style="width:468.18pt;height:1.73004pt;mso-position-horizontal-relative:char;mso-position-vertical-relative:line" coordsize="59458,219">
                 <v:shape id="Shape 6807" style="position:absolute;width:59436;height:203;left:0;top:0;" coordsize="5943600,20320" path="m0,0l5943600,0l5943600,20320l0,20320l0,0">
                   <v:stroke weight="0pt" endcap="flat" joinstyle="miter" miterlimit="10" on="false" color="#000000" opacity="0"/>
                   <v:fill on="true" color="#a0a0a0"/>
@@ -2092,10 +2092,10 @@
         <mc:AlternateContent>
           <mc:Choice Requires="wpg">
             <w:drawing>
-              <wp:inline distT="0" distB="0" distL="0" distR="0" wp14:anchorId="7659570E" wp14:editId="5C6D9FD5">
+              <wp:inline distT="0" distB="0" distL="0" distR="0" wp14:anchorId="080311F4" wp14:editId="78D461C1">
                 <wp:extent cx="5945885" cy="20700"/>
                 <wp:effectExtent l="0" t="0" r="0" b="0"/>
-                <wp:docPr id="5150" name="Group 5150"/>
+                <wp:docPr id="5296" name="Group 5296"/>
                 <wp:cNvGraphicFramePr/>
                 <a:graphic xmlns:a="http://schemas.openxmlformats.org/drawingml/2006/main">
                   <a:graphicData uri="http://schemas.microsoft.com/office/word/2010/wordprocessingGroup">
@@ -2603,7 +2603,7 @@
           </mc:Choice>
           <mc:Fallback xmlns:a="http://schemas.openxmlformats.org/drawingml/2006/main">
             <w:pict>
-              <v:group id="Group 5150" style="width:468.18pt;height:1.62994pt;mso-position-horizontal-relative:char;mso-position-vertical-relative:line" coordsize="59458,207">
+              <v:group id="Group 5296" style="width:468.18pt;height:1.62994pt;mso-position-horizontal-relative:char;mso-position-vertical-relative:line" coordsize="59458,207">
                 <v:shape id="Shape 6827" style="position:absolute;width:59436;height:203;left:0;top:0;" coordsize="5943600,20320" path="m0,0l5943600,0l5943600,20320l0,20320l0,0">
                   <v:stroke weight="0pt" endcap="flat" joinstyle="miter" miterlimit="10" on="false" color="#000000" opacity="0"/>
                   <v:fill on="true" color="#a0a0a0"/>
@@ -2763,10 +2763,10 @@
         <mc:AlternateContent>
           <mc:Choice Requires="wpg">
             <w:drawing>
-              <wp:inline distT="0" distB="0" distL="0" distR="0" wp14:anchorId="74999002" wp14:editId="42369091">
+              <wp:inline distT="0" distB="0" distL="0" distR="0" wp14:anchorId="06B71816" wp14:editId="3923B7EB">
                 <wp:extent cx="5945885" cy="21209"/>
                 <wp:effectExtent l="0" t="0" r="0" b="0"/>
-                <wp:docPr id="5151" name="Group 5151"/>
+                <wp:docPr id="5297" name="Group 5297"/>
                 <wp:cNvGraphicFramePr/>
                 <a:graphic xmlns:a="http://schemas.openxmlformats.org/drawingml/2006/main">
                   <a:graphicData uri="http://schemas.microsoft.com/office/word/2010/wordprocessingGroup">
@@ -3274,7 +3274,7 @@
           </mc:Choice>
           <mc:Fallback xmlns:a="http://schemas.openxmlformats.org/drawingml/2006/main">
             <w:pict>
-              <v:group id="Group 5151" style="width:468.18pt;height:1.67001pt;mso-position-horizontal-relative:char;mso-position-vertical-relative:line" coordsize="59458,212">
+              <v:group id="Group 5297" style="width:468.18pt;height:1.67001pt;mso-position-horizontal-relative:char;mso-position-vertical-relative:line" coordsize="59458,212">
                 <v:shape id="Shape 6845" style="position:absolute;width:59436;height:203;left:0;top:0;" coordsize="5943600,20320" path="m0,0l5943600,0l5943600,20320l0,20320l0,0">
                   <v:stroke weight="0pt" endcap="flat" joinstyle="miter" miterlimit="10" on="false" color="#000000" opacity="0"/>
                   <v:fill on="true" color="#a0a0a0"/>
@@ -3403,10 +3403,10 @@
         <mc:AlternateContent>
           <mc:Choice Requires="wpg">
             <w:drawing>
-              <wp:inline distT="0" distB="0" distL="0" distR="0" wp14:anchorId="4254DD9F" wp14:editId="4CC6F986">
+              <wp:inline distT="0" distB="0" distL="0" distR="0" wp14:anchorId="2A53877E" wp14:editId="6181AD6F">
                 <wp:extent cx="5945885" cy="21590"/>
                 <wp:effectExtent l="0" t="0" r="0" b="0"/>
-                <wp:docPr id="5152" name="Group 5152"/>
+                <wp:docPr id="5298" name="Group 5298"/>
                 <wp:cNvGraphicFramePr/>
                 <a:graphic xmlns:a="http://schemas.openxmlformats.org/drawingml/2006/main">
                   <a:graphicData uri="http://schemas.microsoft.com/office/word/2010/wordprocessingGroup">
@@ -3914,7 +3914,7 @@
           </mc:Choice>
           <mc:Fallback xmlns:a="http://schemas.openxmlformats.org/drawingml/2006/main">
             <w:pict>
-              <v:group id="Group 5152" style="width:468.18pt;height:1.70001pt;mso-position-horizontal-relative:char;mso-position-vertical-relative:line" coordsize="59458,215">
+              <v:group id="Group 5298" style="width:468.18pt;height:1.70001pt;mso-position-horizontal-relative:char;mso-position-vertical-relative:line" coordsize="59458,215">
                 <v:shape id="Shape 6863" style="position:absolute;width:59436;height:203;left:0;top:0;" coordsize="5943600,20320" path="m0,0l5943600,0l5943600,20320l0,20320l0,0">
                   <v:stroke weight="0pt" endcap="flat" joinstyle="miter" miterlimit="10" on="false" color="#000000" opacity="0"/>
                   <v:fill on="true" color="#a0a0a0"/>
@@ -4062,10 +4062,10 @@
         <mc:AlternateContent>
           <mc:Choice Requires="wpg">
             <w:drawing>
-              <wp:inline distT="0" distB="0" distL="0" distR="0" wp14:anchorId="085F5E94" wp14:editId="4DBBFF86">
+              <wp:inline distT="0" distB="0" distL="0" distR="0" wp14:anchorId="46E77229" wp14:editId="38136BE2">
                 <wp:extent cx="5945885" cy="22225"/>
                 <wp:effectExtent l="0" t="0" r="0" b="0"/>
-                <wp:docPr id="5153" name="Group 5153"/>
+                <wp:docPr id="5299" name="Group 5299"/>
                 <wp:cNvGraphicFramePr/>
                 <a:graphic xmlns:a="http://schemas.openxmlformats.org/drawingml/2006/main">
                   <a:graphicData uri="http://schemas.microsoft.com/office/word/2010/wordprocessingGroup">
@@ -4573,7 +4573,7 @@
           </mc:Choice>
           <mc:Fallback xmlns:a="http://schemas.openxmlformats.org/drawingml/2006/main">
             <w:pict>
-              <v:group id="Group 5153" style="width:468.18pt;height:1.75pt;mso-position-horizontal-relative:char;mso-position-vertical-relative:line" coordsize="59458,222">
+              <v:group id="Group 5299" style="width:468.18pt;height:1.75pt;mso-position-horizontal-relative:char;mso-position-vertical-relative:line" coordsize="59458,222">
                 <v:shape id="Shape 6883" style="position:absolute;width:59436;height:203;left:0;top:0;" coordsize="5943600,20320" path="m0,0l5943600,0l5943600,20320l0,20320l0,0">
                   <v:stroke weight="0pt" endcap="flat" joinstyle="miter" miterlimit="10" on="false" color="#000000" opacity="0"/>
                   <v:fill on="true" color="#a0a0a0"/>
@@ -4713,10 +4713,10 @@
         <mc:AlternateContent>
           <mc:Choice Requires="wpg">
             <w:drawing>
-              <wp:inline distT="0" distB="0" distL="0" distR="0" wp14:anchorId="40469484" wp14:editId="6EBC67D0">
+              <wp:inline distT="0" distB="0" distL="0" distR="0" wp14:anchorId="5C1E8089" wp14:editId="1935F3E5">
                 <wp:extent cx="5945885" cy="20700"/>
                 <wp:effectExtent l="0" t="0" r="0" b="0"/>
-                <wp:docPr id="6170" name="Group 6170"/>
+                <wp:docPr id="5348" name="Group 5348"/>
                 <wp:cNvGraphicFramePr/>
                 <a:graphic xmlns:a="http://schemas.openxmlformats.org/drawingml/2006/main">
                   <a:graphicData uri="http://schemas.microsoft.com/office/word/2010/wordprocessingGroup">
@@ -5224,7 +5224,7 @@
           </mc:Choice>
           <mc:Fallback xmlns:a="http://schemas.openxmlformats.org/drawingml/2006/main">
             <w:pict>
-              <v:group id="Group 6170" style="width:468.18pt;height:1.62994pt;mso-position-horizontal-relative:char;mso-position-vertical-relative:line" coordsize="59458,207">
+              <v:group id="Group 5348" style="width:468.18pt;height:1.62994pt;mso-position-horizontal-relative:char;mso-position-vertical-relative:line" coordsize="59458,207">
                 <v:shape id="Shape 6903" style="position:absolute;width:59436;height:203;left:0;top:0;" coordsize="5943600,20320" path="m0,0l5943600,0l5943600,20320l0,20320l0,0">
                   <v:stroke weight="0pt" endcap="flat" joinstyle="miter" miterlimit="10" on="false" color="#000000" opacity="0"/>
                   <v:fill on="true" color="#a0a0a0"/>
@@ -5368,10 +5368,10 @@
         <mc:AlternateContent>
           <mc:Choice Requires="wpg">
             <w:drawing>
-              <wp:inline distT="0" distB="0" distL="0" distR="0" wp14:anchorId="4CE78AED" wp14:editId="69C98362">
+              <wp:inline distT="0" distB="0" distL="0" distR="0" wp14:anchorId="45DA4FCA" wp14:editId="6333C9AE">
                 <wp:extent cx="5945885" cy="21209"/>
                 <wp:effectExtent l="0" t="0" r="0" b="0"/>
-                <wp:docPr id="6178" name="Group 6178"/>
+                <wp:docPr id="5352" name="Group 5352"/>
                 <wp:cNvGraphicFramePr/>
                 <a:graphic xmlns:a="http://schemas.openxmlformats.org/drawingml/2006/main">
                   <a:graphicData uri="http://schemas.microsoft.com/office/word/2010/wordprocessingGroup">
@@ -5879,7 +5879,7 @@
           </mc:Choice>
           <mc:Fallback xmlns:a="http://schemas.openxmlformats.org/drawingml/2006/main">
             <w:pict>
-              <v:group id="Group 6178" style="width:468.18pt;height:1.66998pt;mso-position-horizontal-relative:char;mso-position-vertical-relative:line" coordsize="59458,212">
+              <v:group id="Group 5352" style="width:468.18pt;height:1.66998pt;mso-position-horizontal-relative:char;mso-position-vertical-relative:line" coordsize="59458,212">
                 <v:shape id="Shape 6923" style="position:absolute;width:59436;height:203;left:0;top:0;" coordsize="5943600,20320" path="m0,0l5943600,0l5943600,20320l0,20320l0,0">
                   <v:stroke weight="0pt" endcap="flat" joinstyle="miter" miterlimit="10" on="false" color="#000000" opacity="0"/>
                   <v:fill on="true" color="#a0a0a0"/>
@@ -6056,10 +6056,10 @@
         <mc:AlternateContent>
           <mc:Choice Requires="wpg">
             <w:drawing>
-              <wp:inline distT="0" distB="0" distL="0" distR="0" wp14:anchorId="72C225E8" wp14:editId="1D353749">
+              <wp:inline distT="0" distB="0" distL="0" distR="0" wp14:anchorId="54CCF51F" wp14:editId="55E48917">
                 <wp:extent cx="5945885" cy="21972"/>
                 <wp:effectExtent l="0" t="0" r="0" b="0"/>
-                <wp:docPr id="6183" name="Group 6183"/>
+                <wp:docPr id="5355" name="Group 5355"/>
                 <wp:cNvGraphicFramePr/>
                 <a:graphic xmlns:a="http://schemas.openxmlformats.org/drawingml/2006/main">
                   <a:graphicData uri="http://schemas.microsoft.com/office/word/2010/wordprocessingGroup">
@@ -6567,7 +6567,7 @@
           </mc:Choice>
           <mc:Fallback xmlns:a="http://schemas.openxmlformats.org/drawingml/2006/main">
             <w:pict>
-              <v:group id="Group 6183" style="width:468.18pt;height:1.73004pt;mso-position-horizontal-relative:char;mso-position-vertical-relative:line" coordsize="59458,219">
+              <v:group id="Group 5355" style="width:468.18pt;height:1.73004pt;mso-position-horizontal-relative:char;mso-position-vertical-relative:line" coordsize="59458,219">
                 <v:shape id="Shape 6941" style="position:absolute;width:59436;height:203;left:0;top:0;" coordsize="5943600,20320" path="m0,0l5943600,0l5943600,20320l0,20320l0,0">
                   <v:stroke weight="0pt" endcap="flat" joinstyle="miter" miterlimit="10" on="false" color="#000000" opacity="0"/>
                   <v:fill on="true" color="#a0a0a0"/>
@@ -6710,10 +6710,10 @@
         <mc:AlternateContent>
           <mc:Choice Requires="wpg">
             <w:drawing>
-              <wp:inline distT="0" distB="0" distL="0" distR="0" wp14:anchorId="1D96A4B1" wp14:editId="3738E47B">
+              <wp:inline distT="0" distB="0" distL="0" distR="0" wp14:anchorId="3B6C2799" wp14:editId="3F37F62B">
                 <wp:extent cx="5945885" cy="22225"/>
                 <wp:effectExtent l="0" t="0" r="0" b="0"/>
-                <wp:docPr id="6188" name="Group 6188"/>
+                <wp:docPr id="5357" name="Group 5357"/>
                 <wp:cNvGraphicFramePr/>
                 <a:graphic xmlns:a="http://schemas.openxmlformats.org/drawingml/2006/main">
                   <a:graphicData uri="http://schemas.microsoft.com/office/word/2010/wordprocessingGroup">
@@ -7221,7 +7221,7 @@
           </mc:Choice>
           <mc:Fallback xmlns:a="http://schemas.openxmlformats.org/drawingml/2006/main">
             <w:pict>
-              <v:group id="Group 6188" style="width:468.18pt;height:1.75pt;mso-position-horizontal-relative:char;mso-position-vertical-relative:line" coordsize="59458,222">
+              <v:group id="Group 5357" style="width:468.18pt;height:1.75pt;mso-position-horizontal-relative:char;mso-position-vertical-relative:line" coordsize="59458,222">
                 <v:shape id="Shape 6961" style="position:absolute;width:59436;height:203;left:0;top:0;" coordsize="5943600,20320" path="m0,0l5943600,0l5943600,20320l0,20320l0,0">
                   <v:stroke weight="0pt" endcap="flat" joinstyle="miter" miterlimit="10" on="false" color="#000000" opacity="0"/>
                   <v:fill on="true" color="#a0a0a0"/>
@@ -7359,10 +7359,10 @@
         <mc:AlternateContent>
           <mc:Choice Requires="wpg">
             <w:drawing>
-              <wp:inline distT="0" distB="0" distL="0" distR="0" wp14:anchorId="1CA215C8" wp14:editId="112A5DFE">
+              <wp:inline distT="0" distB="0" distL="0" distR="0" wp14:anchorId="60EBA470" wp14:editId="4B104E34">
                 <wp:extent cx="5945885" cy="20955"/>
                 <wp:effectExtent l="0" t="0" r="0" b="0"/>
-                <wp:docPr id="5349" name="Group 5349"/>
+                <wp:docPr id="5493" name="Group 5493"/>
                 <wp:cNvGraphicFramePr/>
                 <a:graphic xmlns:a="http://schemas.openxmlformats.org/drawingml/2006/main">
                   <a:graphicData uri="http://schemas.microsoft.com/office/word/2010/wordprocessingGroup">
@@ -7870,7 +7870,7 @@
           </mc:Choice>
           <mc:Fallback xmlns:a="http://schemas.openxmlformats.org/drawingml/2006/main">
             <w:pict>
-              <v:group id="Group 5349" style="width:468.18pt;height:1.64996pt;mso-position-horizontal-relative:char;mso-position-vertical-relative:line" coordsize="59458,209">
+              <v:group id="Group 5493" style="width:468.18pt;height:1.64996pt;mso-position-horizontal-relative:char;mso-position-vertical-relative:line" coordsize="59458,209">
                 <v:shape id="Shape 6981" style="position:absolute;width:59436;height:203;left:0;top:0;" coordsize="5943600,20320" path="m0,0l5943600,0l5943600,20320l0,20320l0,0">
                   <v:stroke weight="0pt" endcap="flat" joinstyle="miter" miterlimit="10" on="false" color="#000000" opacity="0"/>
                   <v:fill on="true" color="#a0a0a0"/>
@@ -8016,10 +8016,10 @@
         <mc:AlternateContent>
           <mc:Choice Requires="wpg">
             <w:drawing>
-              <wp:inline distT="0" distB="0" distL="0" distR="0" wp14:anchorId="2164A5ED" wp14:editId="2D3E47F8">
+              <wp:inline distT="0" distB="0" distL="0" distR="0" wp14:anchorId="4B9501D9" wp14:editId="2E74BD52">
                 <wp:extent cx="5945885" cy="21209"/>
                 <wp:effectExtent l="0" t="0" r="0" b="0"/>
-                <wp:docPr id="5350" name="Group 5350"/>
+                <wp:docPr id="5494" name="Group 5494"/>
                 <wp:cNvGraphicFramePr/>
                 <a:graphic xmlns:a="http://schemas.openxmlformats.org/drawingml/2006/main">
                   <a:graphicData uri="http://schemas.microsoft.com/office/word/2010/wordprocessingGroup">
@@ -8527,7 +8527,7 @@
           </mc:Choice>
           <mc:Fallback xmlns:a="http://schemas.openxmlformats.org/drawingml/2006/main">
             <w:pict>
-              <v:group id="Group 5350" style="width:468.18pt;height:1.67001pt;mso-position-horizontal-relative:char;mso-position-vertical-relative:line" coordsize="59458,212">
+              <v:group id="Group 5494" style="width:468.18pt;height:1.67001pt;mso-position-horizontal-relative:char;mso-position-vertical-relative:line" coordsize="59458,212">
                 <v:shape id="Shape 7001" style="position:absolute;width:59436;height:203;left:0;top:0;" coordsize="5943600,20320" path="m0,0l5943600,0l5943600,20320l0,20320l0,0">
                   <v:stroke weight="0pt" endcap="flat" joinstyle="miter" miterlimit="10" on="false" color="#000000" opacity="0"/>
                   <v:fill on="true" color="#a0a0a0"/>
@@ -8676,10 +8676,10 @@
         <mc:AlternateContent>
           <mc:Choice Requires="wpg">
             <w:drawing>
-              <wp:inline distT="0" distB="0" distL="0" distR="0" wp14:anchorId="495BCAE3" wp14:editId="61833F7A">
+              <wp:inline distT="0" distB="0" distL="0" distR="0" wp14:anchorId="4F8FC44F" wp14:editId="596AFC84">
                 <wp:extent cx="5945885" cy="21971"/>
                 <wp:effectExtent l="0" t="0" r="0" b="0"/>
-                <wp:docPr id="5351" name="Group 5351"/>
+                <wp:docPr id="5495" name="Group 5495"/>
                 <wp:cNvGraphicFramePr/>
                 <a:graphic xmlns:a="http://schemas.openxmlformats.org/drawingml/2006/main">
                   <a:graphicData uri="http://schemas.microsoft.com/office/word/2010/wordprocessingGroup">
@@ -9187,7 +9187,7 @@
           </mc:Choice>
           <mc:Fallback xmlns:a="http://schemas.openxmlformats.org/drawingml/2006/main">
             <w:pict>
-              <v:group id="Group 5351" style="width:468.18pt;height:1.73001pt;mso-position-horizontal-relative:char;mso-position-vertical-relative:line" coordsize="59458,219">
+              <v:group id="Group 5495" style="width:468.18pt;height:1.73001pt;mso-position-horizontal-relative:char;mso-position-vertical-relative:line" coordsize="59458,219">
                 <v:shape id="Shape 7021" style="position:absolute;width:59436;height:203;left:0;top:0;" coordsize="5943600,20320" path="m0,0l5943600,0l5943600,20320l0,20320l0,0">
                   <v:stroke weight="0pt" endcap="flat" joinstyle="miter" miterlimit="10" on="false" color="#000000" opacity="0"/>
                   <v:fill on="true" color="#a0a0a0"/>
@@ -9341,10 +9341,10 @@
         <mc:AlternateContent>
           <mc:Choice Requires="wpg">
             <w:drawing>
-              <wp:inline distT="0" distB="0" distL="0" distR="0" wp14:anchorId="0327236F" wp14:editId="0F871352">
+              <wp:inline distT="0" distB="0" distL="0" distR="0" wp14:anchorId="78662A6B" wp14:editId="02763C3E">
                 <wp:extent cx="5945885" cy="22225"/>
                 <wp:effectExtent l="0" t="0" r="0" b="0"/>
-                <wp:docPr id="5352" name="Group 5352"/>
+                <wp:docPr id="5496" name="Group 5496"/>
                 <wp:cNvGraphicFramePr/>
                 <a:graphic xmlns:a="http://schemas.openxmlformats.org/drawingml/2006/main">
                   <a:graphicData uri="http://schemas.microsoft.com/office/word/2010/wordprocessingGroup">
@@ -9852,7 +9852,7 @@
           </mc:Choice>
           <mc:Fallback xmlns:a="http://schemas.openxmlformats.org/drawingml/2006/main">
             <w:pict>
-              <v:group id="Group 5352" style="width:468.18pt;height:1.75pt;mso-position-horizontal-relative:char;mso-position-vertical-relative:line" coordsize="59458,222">
+              <v:group id="Group 5496" style="width:468.18pt;height:1.75pt;mso-position-horizontal-relative:char;mso-position-vertical-relative:line" coordsize="59458,222">
                 <v:shape id="Shape 7041" style="position:absolute;width:59436;height:203;left:0;top:0;" coordsize="5943600,20320" path="m0,0l5943600,0l5943600,20320l0,20320l0,0">
                   <v:stroke weight="0pt" endcap="flat" joinstyle="miter" miterlimit="10" on="false" color="#000000" opacity="0"/>
                   <v:fill on="true" color="#a0a0a0"/>
@@ -9981,10 +9981,10 @@
         <mc:AlternateContent>
           <mc:Choice Requires="wpg">
             <w:drawing>
-              <wp:inline distT="0" distB="0" distL="0" distR="0" wp14:anchorId="4BFCFAE5" wp14:editId="43320652">
+              <wp:inline distT="0" distB="0" distL="0" distR="0" wp14:anchorId="0CF1C342" wp14:editId="31DC7F51">
                 <wp:extent cx="5945885" cy="20700"/>
                 <wp:effectExtent l="0" t="0" r="0" b="0"/>
-                <wp:docPr id="5515" name="Group 5515"/>
+                <wp:docPr id="5997" name="Group 5997"/>
                 <wp:cNvGraphicFramePr/>
                 <a:graphic xmlns:a="http://schemas.openxmlformats.org/drawingml/2006/main">
                   <a:graphicData uri="http://schemas.microsoft.com/office/word/2010/wordprocessingGroup">
@@ -10492,7 +10492,7 @@
           </mc:Choice>
           <mc:Fallback xmlns:a="http://schemas.openxmlformats.org/drawingml/2006/main">
             <w:pict>
-              <v:group id="Group 5515" style="width:468.18pt;height:1.62994pt;mso-position-horizontal-relative:char;mso-position-vertical-relative:line" coordsize="59458,207">
+              <v:group id="Group 5997" style="width:468.18pt;height:1.62994pt;mso-position-horizontal-relative:char;mso-position-vertical-relative:line" coordsize="59458,207">
                 <v:shape id="Shape 7061" style="position:absolute;width:59436;height:203;left:0;top:0;" coordsize="5943600,20320" path="m0,0l5943600,0l5943600,20320l0,20320l0,0">
                   <v:stroke weight="0pt" endcap="flat" joinstyle="miter" miterlimit="10" on="false" color="#000000" opacity="0"/>
                   <v:fill on="true" color="#a0a0a0"/>
@@ -10640,10 +10640,10 @@
         <mc:AlternateContent>
           <mc:Choice Requires="wpg">
             <w:drawing>
-              <wp:inline distT="0" distB="0" distL="0" distR="0" wp14:anchorId="71295D8A" wp14:editId="5AF66A99">
+              <wp:inline distT="0" distB="0" distL="0" distR="0" wp14:anchorId="730D03B4" wp14:editId="555417AC">
                 <wp:extent cx="5945885" cy="21209"/>
                 <wp:effectExtent l="0" t="0" r="0" b="0"/>
-                <wp:docPr id="5516" name="Group 5516"/>
+                <wp:docPr id="5998" name="Group 5998"/>
                 <wp:cNvGraphicFramePr/>
                 <a:graphic xmlns:a="http://schemas.openxmlformats.org/drawingml/2006/main">
                   <a:graphicData uri="http://schemas.microsoft.com/office/word/2010/wordprocessingGroup">
@@ -11151,7 +11151,7 @@
           </mc:Choice>
           <mc:Fallback xmlns:a="http://schemas.openxmlformats.org/drawingml/2006/main">
             <w:pict>
-              <v:group id="Group 5516" style="width:468.18pt;height:1.67001pt;mso-position-horizontal-relative:char;mso-position-vertical-relative:line" coordsize="59458,212">
+              <v:group id="Group 5998" style="width:468.18pt;height:1.67001pt;mso-position-horizontal-relative:char;mso-position-vertical-relative:line" coordsize="59458,212">
                 <v:shape id="Shape 7081" style="position:absolute;width:59436;height:203;left:0;top:0;" coordsize="5943600,20320" path="m0,0l5943600,0l5943600,20320l0,20320l0,0">
                   <v:stroke weight="0pt" endcap="flat" joinstyle="miter" miterlimit="10" on="false" color="#000000" opacity="0"/>
                   <v:fill on="true" color="#a0a0a0"/>
@@ -11333,10 +11333,10 @@
         <mc:AlternateContent>
           <mc:Choice Requires="wpg">
             <w:drawing>
-              <wp:inline distT="0" distB="0" distL="0" distR="0" wp14:anchorId="3A6445FA" wp14:editId="33DD4BDB">
+              <wp:inline distT="0" distB="0" distL="0" distR="0" wp14:anchorId="161D0CB6" wp14:editId="737D52D1">
                 <wp:extent cx="5945885" cy="21844"/>
                 <wp:effectExtent l="0" t="0" r="0" b="0"/>
-                <wp:docPr id="5517" name="Group 5517"/>
+                <wp:docPr id="5999" name="Group 5999"/>
                 <wp:cNvGraphicFramePr/>
                 <a:graphic xmlns:a="http://schemas.openxmlformats.org/drawingml/2006/main">
                   <a:graphicData uri="http://schemas.microsoft.com/office/word/2010/wordprocessingGroup">
@@ -11844,7 +11844,7 @@
           </mc:Choice>
           <mc:Fallback xmlns:a="http://schemas.openxmlformats.org/drawingml/2006/main">
             <w:pict>
-              <v:group id="Group 5517" style="width:468.18pt;height:1.72pt;mso-position-horizontal-relative:char;mso-position-vertical-relative:line" coordsize="59458,218">
+              <v:group id="Group 5999" style="width:468.18pt;height:1.72pt;mso-position-horizontal-relative:char;mso-position-vertical-relative:line" coordsize="59458,218">
                 <v:shape id="Shape 7101" style="position:absolute;width:59436;height:203;left:0;top:0;" coordsize="5943600,20320" path="m0,0l5943600,0l5943600,20320l0,20320l0,0">
                   <v:stroke weight="0pt" endcap="flat" joinstyle="miter" miterlimit="10" on="false" color="#000000" opacity="0"/>
                   <v:fill on="true" color="#a0a0a0"/>
@@ -11978,10 +11978,10 @@
         <mc:AlternateContent>
           <mc:Choice Requires="wpg">
             <w:drawing>
-              <wp:inline distT="0" distB="0" distL="0" distR="0" wp14:anchorId="4BB3E7B3" wp14:editId="4FCCA162">
+              <wp:inline distT="0" distB="0" distL="0" distR="0" wp14:anchorId="29DF1EAD" wp14:editId="6FA8AB56">
                 <wp:extent cx="5945885" cy="22225"/>
                 <wp:effectExtent l="0" t="0" r="0" b="0"/>
-                <wp:docPr id="5518" name="Group 5518"/>
+                <wp:docPr id="6000" name="Group 6000"/>
                 <wp:cNvGraphicFramePr/>
                 <a:graphic xmlns:a="http://schemas.openxmlformats.org/drawingml/2006/main">
                   <a:graphicData uri="http://schemas.microsoft.com/office/word/2010/wordprocessingGroup">
@@ -12489,7 +12489,7 @@
           </mc:Choice>
           <mc:Fallback xmlns:a="http://schemas.openxmlformats.org/drawingml/2006/main">
             <w:pict>
-              <v:group id="Group 5518" style="width:468.18pt;height:1.75pt;mso-position-horizontal-relative:char;mso-position-vertical-relative:line" coordsize="59458,222">
+              <v:group id="Group 6000" style="width:468.18pt;height:1.75pt;mso-position-horizontal-relative:char;mso-position-vertical-relative:line" coordsize="59458,222">
                 <v:shape id="Shape 7119" style="position:absolute;width:59436;height:203;left:0;top:0;" coordsize="5943600,20320" path="m0,0l5943600,0l5943600,20320l0,20320l0,0">
                   <v:stroke weight="0pt" endcap="flat" joinstyle="miter" miterlimit="10" on="false" color="#000000" opacity="0"/>
                   <v:fill on="true" color="#a0a0a0"/>
@@ -12625,10 +12625,10 @@
         <mc:AlternateContent>
           <mc:Choice Requires="wpg">
             <w:drawing>
-              <wp:inline distT="0" distB="0" distL="0" distR="0" wp14:anchorId="785800E5" wp14:editId="6327384A">
+              <wp:inline distT="0" distB="0" distL="0" distR="0" wp14:anchorId="34C1EFF0" wp14:editId="0F1EA108">
                 <wp:extent cx="5945885" cy="20701"/>
                 <wp:effectExtent l="0" t="0" r="0" b="0"/>
-                <wp:docPr id="5345" name="Group 5345"/>
+                <wp:docPr id="6165" name="Group 6165"/>
                 <wp:cNvGraphicFramePr/>
                 <a:graphic xmlns:a="http://schemas.openxmlformats.org/drawingml/2006/main">
                   <a:graphicData uri="http://schemas.microsoft.com/office/word/2010/wordprocessingGroup">
@@ -13136,7 +13136,7 @@
           </mc:Choice>
           <mc:Fallback xmlns:a="http://schemas.openxmlformats.org/drawingml/2006/main">
             <w:pict>
-              <v:group id="Group 5345" style="width:468.18pt;height:1.63pt;mso-position-horizontal-relative:char;mso-position-vertical-relative:line" coordsize="59458,207">
+              <v:group id="Group 6165" style="width:468.18pt;height:1.63pt;mso-position-horizontal-relative:char;mso-position-vertical-relative:line" coordsize="59458,207">
                 <v:shape id="Shape 7137" style="position:absolute;width:59436;height:203;left:0;top:0;" coordsize="5943600,20320" path="m0,0l5943600,0l5943600,20320l0,20320l0,0">
                   <v:stroke weight="0pt" endcap="flat" joinstyle="miter" miterlimit="10" on="false" color="#000000" opacity="0"/>
                   <v:fill on="true" color="#a0a0a0"/>
@@ -13270,10 +13270,10 @@
         <mc:AlternateContent>
           <mc:Choice Requires="wpg">
             <w:drawing>
-              <wp:inline distT="0" distB="0" distL="0" distR="0" wp14:anchorId="72A76CAF" wp14:editId="1C0174CE">
+              <wp:inline distT="0" distB="0" distL="0" distR="0" wp14:anchorId="25147764" wp14:editId="1D34F5BF">
                 <wp:extent cx="5945885" cy="21209"/>
                 <wp:effectExtent l="0" t="0" r="0" b="0"/>
-                <wp:docPr id="5346" name="Group 5346"/>
+                <wp:docPr id="6166" name="Group 6166"/>
                 <wp:cNvGraphicFramePr/>
                 <a:graphic xmlns:a="http://schemas.openxmlformats.org/drawingml/2006/main">
                   <a:graphicData uri="http://schemas.microsoft.com/office/word/2010/wordprocessingGroup">
@@ -13781,7 +13781,7 @@
           </mc:Choice>
           <mc:Fallback xmlns:a="http://schemas.openxmlformats.org/drawingml/2006/main">
             <w:pict>
-              <v:group id="Group 5346" style="width:468.18pt;height:1.67001pt;mso-position-horizontal-relative:char;mso-position-vertical-relative:line" coordsize="59458,212">
+              <v:group id="Group 6166" style="width:468.18pt;height:1.67001pt;mso-position-horizontal-relative:char;mso-position-vertical-relative:line" coordsize="59458,212">
                 <v:shape id="Shape 7155" style="position:absolute;width:59436;height:203;left:0;top:0;" coordsize="5943600,20320" path="m0,0l5943600,0l5943600,20320l0,20320l0,0">
                   <v:stroke weight="0pt" endcap="flat" joinstyle="miter" miterlimit="10" on="false" color="#000000" opacity="0"/>
                   <v:fill on="true" color="#a0a0a0"/>
@@ -13919,10 +13919,10 @@
         <mc:AlternateContent>
           <mc:Choice Requires="wpg">
             <w:drawing>
-              <wp:inline distT="0" distB="0" distL="0" distR="0" wp14:anchorId="7EEAC6CB" wp14:editId="0FD95049">
+              <wp:inline distT="0" distB="0" distL="0" distR="0" wp14:anchorId="13C45FA1" wp14:editId="6F9562A6">
                 <wp:extent cx="5945885" cy="21590"/>
                 <wp:effectExtent l="0" t="0" r="0" b="0"/>
-                <wp:docPr id="5347" name="Group 5347"/>
+                <wp:docPr id="6167" name="Group 6167"/>
                 <wp:cNvGraphicFramePr/>
                 <a:graphic xmlns:a="http://schemas.openxmlformats.org/drawingml/2006/main">
                   <a:graphicData uri="http://schemas.microsoft.com/office/word/2010/wordprocessingGroup">
@@ -14430,7 +14430,7 @@
           </mc:Choice>
           <mc:Fallback xmlns:a="http://schemas.openxmlformats.org/drawingml/2006/main">
             <w:pict>
-              <v:group id="Group 5347" style="width:468.18pt;height:1.70001pt;mso-position-horizontal-relative:char;mso-position-vertical-relative:line" coordsize="59458,215">
+              <v:group id="Group 6167" style="width:468.18pt;height:1.70001pt;mso-position-horizontal-relative:char;mso-position-vertical-relative:line" coordsize="59458,215">
                 <v:shape id="Shape 7175" style="position:absolute;width:59436;height:203;left:0;top:0;" coordsize="5943600,20320" path="m0,0l5943600,0l5943600,20320l0,20320l0,0">
                   <v:stroke weight="0pt" endcap="flat" joinstyle="miter" miterlimit="10" on="false" color="#000000" opacity="0"/>
                   <v:fill on="true" color="#a0a0a0"/>
@@ -14579,10 +14579,10 @@
         <mc:AlternateContent>
           <mc:Choice Requires="wpg">
             <w:drawing>
-              <wp:inline distT="0" distB="0" distL="0" distR="0" wp14:anchorId="1EE9C1C9" wp14:editId="08BBF784">
+              <wp:inline distT="0" distB="0" distL="0" distR="0" wp14:anchorId="50F67F3A" wp14:editId="1B7BB6E7">
                 <wp:extent cx="5945885" cy="22225"/>
                 <wp:effectExtent l="0" t="0" r="0" b="0"/>
-                <wp:docPr id="5348" name="Group 5348"/>
+                <wp:docPr id="6168" name="Group 6168"/>
                 <wp:cNvGraphicFramePr/>
                 <a:graphic xmlns:a="http://schemas.openxmlformats.org/drawingml/2006/main">
                   <a:graphicData uri="http://schemas.microsoft.com/office/word/2010/wordprocessingGroup">
@@ -15090,7 +15090,7 @@
           </mc:Choice>
           <mc:Fallback xmlns:a="http://schemas.openxmlformats.org/drawingml/2006/main">
             <w:pict>
-              <v:group id="Group 5348" style="width:468.18pt;height:1.75pt;mso-position-horizontal-relative:char;mso-position-vertical-relative:line" coordsize="59458,222">
+              <v:group id="Group 6168" style="width:468.18pt;height:1.75pt;mso-position-horizontal-relative:char;mso-position-vertical-relative:line" coordsize="59458,222">
                 <v:shape id="Shape 7195" style="position:absolute;width:59436;height:203;left:0;top:0;" coordsize="5943600,20320" path="m0,0l5943600,0l5943600,20320l0,20320l0,0">
                   <v:stroke weight="0pt" endcap="flat" joinstyle="miter" miterlimit="10" on="false" color="#000000" opacity="0"/>
                   <v:fill on="true" color="#a0a0a0"/>
@@ -15233,10 +15233,10 @@
         <mc:AlternateContent>
           <mc:Choice Requires="wpg">
             <w:drawing>
-              <wp:inline distT="0" distB="0" distL="0" distR="0" wp14:anchorId="2E133EF9" wp14:editId="33639CE4">
+              <wp:inline distT="0" distB="0" distL="0" distR="0" wp14:anchorId="742485CB" wp14:editId="382DC0B2">
                 <wp:extent cx="5945885" cy="20700"/>
                 <wp:effectExtent l="0" t="0" r="0" b="0"/>
-                <wp:docPr id="5975" name="Group 5975"/>
+                <wp:docPr id="6088" name="Group 6088"/>
                 <wp:cNvGraphicFramePr/>
                 <a:graphic xmlns:a="http://schemas.openxmlformats.org/drawingml/2006/main">
                   <a:graphicData uri="http://schemas.microsoft.com/office/word/2010/wordprocessingGroup">
@@ -15744,7 +15744,7 @@
           </mc:Choice>
           <mc:Fallback xmlns:a="http://schemas.openxmlformats.org/drawingml/2006/main">
             <w:pict>
-              <v:group id="Group 5975" style="width:468.18pt;height:1.62994pt;mso-position-horizontal-relative:char;mso-position-vertical-relative:line" coordsize="59458,207">
+              <v:group id="Group 6088" style="width:468.18pt;height:1.62994pt;mso-position-horizontal-relative:char;mso-position-vertical-relative:line" coordsize="59458,207">
                 <v:shape id="Shape 7215" style="position:absolute;width:59436;height:203;left:0;top:0;" coordsize="5943600,20320" path="m0,0l5943600,0l5943600,20320l0,20320l0,0">
                   <v:stroke weight="0pt" endcap="flat" joinstyle="miter" miterlimit="10" on="false" color="#000000" opacity="0"/>
                   <v:fill on="true" color="#a0a0a0"/>
@@ -15884,16 +15884,16 @@
 <file path=word/numbering.xml><?xml version="1.0" encoding="utf-8"?>
 <w:numbering xmlns:wpc="http://schemas.microsoft.com/office/word/2010/wordprocessingCanvas" xmlns:cx="http://schemas.microsoft.com/office/drawing/2014/chartex" xmlns:cx1="http://schemas.microsoft.com/office/drawing/2015/9/8/chartex" xmlns:cx2="http://schemas.microsoft.com/office/drawing/2015/10/21/chartex" xmlns:cx3="http://schemas.microsoft.com/office/drawing/2016/5/9/chartex" xmlns:cx4="http://schemas.microsoft.com/office/drawing/2016/5/10/chartex" xmlns:cx5="http://schemas.microsoft.com/office/drawing/2016/5/11/chartex" xmlns:cx6="http://schemas.microsoft.com/office/drawing/2016/5/12/chartex" xmlns:cx7="http://schemas.microsoft.com/office/drawing/2016/5/13/chartex" xmlns:cx8="http://schemas.microsoft.com/office/drawing/2016/5/14/chartex" xmlns:mc="http://schemas.openxmlformats.org/markup-compatibility/2006" xmlns:aink="http://schemas.microsoft.com/office/drawing/2016/ink" xmlns:am3d="http://schemas.microsoft.com/office/drawing/2017/model3d" xmlns:o="urn:schemas-microsoft-com:office:office" xmlns:r="http://schemas.openxmlformats.org/officeDocument/2006/relationships" xmlns:m="http://schemas.openxmlformats.org/officeDocument/2006/math" xmlns:v="urn:schemas-microsoft-com:vml" xmlns:wp14="http://schemas.microsoft.com/office/word/2010/wordprocessingDrawing" xmlns:wp="http://schemas.openxmlformats.org/drawingml/2006/wordprocessingDrawing" xmlns:w10="urn:schemas-microsoft-com:office:word" xmlns:w="http://schemas.openxmlformats.org/wordprocessingml/2006/main" xmlns:w14="http://schemas.microsoft.com/office/word/2010/wordml" xmlns:w15="http://schemas.microsoft.com/office/word/2012/wordml" xmlns:w16cex="http://schemas.microsoft.com/office/word/2018/wordml/cex" xmlns:w16cid="http://schemas.microsoft.com/office/word/2016/wordml/cid" xmlns:w16="http://schemas.microsoft.com/office/word/2018/wordml" xmlns:w16sdtdh="http://schemas.microsoft.com/office/word/2020/wordml/sdtdatahash" xmlns:w16se="http://schemas.microsoft.com/office/word/2015/wordml/symex" xmlns:wpg="http://schemas.microsoft.com/office/word/2010/wordprocessingGroup" xmlns:wpi="http://schemas.microsoft.com/office/word/2010/wordprocessingInk" xmlns:wne="http://schemas.microsoft.com/office/word/2006/wordml" xmlns:wps="http://schemas.microsoft.com/office/word/2010/wordprocessingShape" mc:Ignorable="w14 w15 w16se w16cid w16 w16cex w16sdtdh wp14">
   <w:abstractNum w:abstractNumId="0" w15:restartNumberingAfterBreak="0">
-    <w:nsid w:val="07DB0892"/>
+    <w:nsid w:val="326927E7"/>
     <w:multiLevelType w:val="hybridMultilevel"/>
-    <w:tmpl w:val="0AEA298C"/>
+    <w:tmpl w:val="1EEEDB24"/>
     <w:lvl w:ilvl="0" w:tplc="FFFFFFFF">
-      <w:start w:val="2"/>
+      <w:start w:val="11"/>
       <w:numFmt w:val="decimal"/>
       <w:lvlText w:val="%1."/>
       <w:lvlJc w:val="left"/>
       <w:pPr>
-        <w:ind w:left="236"/>
+        <w:ind w:left="356"/>
       </w:pPr>
       <w:rPr>
         <w:rFonts w:ascii="Calibri" w:eastAsia="Calibri" w:hAnsi="Calibri" w:cs="Calibri"/>
@@ -16096,16 +16096,16 @@
     </w:lvl>
   </w:abstractNum>
   <w:abstractNum w:abstractNumId="1" w15:restartNumberingAfterBreak="0">
-    <w:nsid w:val="100E2102"/>
+    <w:nsid w:val="32860C75"/>
     <w:multiLevelType w:val="hybridMultilevel"/>
-    <w:tmpl w:val="05F86E5E"/>
+    <w:tmpl w:val="3DF41044"/>
     <w:lvl w:ilvl="0" w:tplc="FFFFFFFF">
-      <w:start w:val="11"/>
+      <w:start w:val="7"/>
       <w:numFmt w:val="decimal"/>
       <w:lvlText w:val="%1."/>
       <w:lvlJc w:val="left"/>
       <w:pPr>
-        <w:ind w:left="356"/>
+        <w:ind w:left="236"/>
       </w:pPr>
       <w:rPr>
         <w:rFonts w:ascii="Calibri" w:eastAsia="Calibri" w:hAnsi="Calibri" w:cs="Calibri"/>
@@ -16308,16 +16308,16 @@
     </w:lvl>
   </w:abstractNum>
   <w:abstractNum w:abstractNumId="2" w15:restartNumberingAfterBreak="0">
-    <w:nsid w:val="17E14B71"/>
+    <w:nsid w:val="479B52ED"/>
     <w:multiLevelType w:val="hybridMultilevel"/>
-    <w:tmpl w:val="FEEA0AAE"/>
+    <w:tmpl w:val="503698DC"/>
     <w:lvl w:ilvl="0" w:tplc="FFFFFFFF">
-      <w:start w:val="7"/>
+      <w:start w:val="22"/>
       <w:numFmt w:val="decimal"/>
       <w:lvlText w:val="%1."/>
       <w:lvlJc w:val="left"/>
       <w:pPr>
-        <w:ind w:left="236"/>
+        <w:ind w:left="356"/>
       </w:pPr>
       <w:rPr>
         <w:rFonts w:ascii="Calibri" w:eastAsia="Calibri" w:hAnsi="Calibri" w:cs="Calibri"/>
@@ -16520,16 +16520,16 @@
     </w:lvl>
   </w:abstractNum>
   <w:abstractNum w:abstractNumId="3" w15:restartNumberingAfterBreak="0">
-    <w:nsid w:val="38B664A3"/>
+    <w:nsid w:val="63795519"/>
     <w:multiLevelType w:val="hybridMultilevel"/>
-    <w:tmpl w:val="26CA8386"/>
+    <w:tmpl w:val="D438FBE0"/>
     <w:lvl w:ilvl="0" w:tplc="FFFFFFFF">
-      <w:start w:val="22"/>
+      <w:start w:val="2"/>
       <w:numFmt w:val="decimal"/>
       <w:lvlText w:val="%1."/>
       <w:lvlJc w:val="left"/>
       <w:pPr>
-        <w:ind w:left="356"/>
+        <w:ind w:left="236"/>
       </w:pPr>
       <w:rPr>
         <w:rFonts w:ascii="Calibri" w:eastAsia="Calibri" w:hAnsi="Calibri" w:cs="Calibri"/>
@@ -16732,16 +16732,16 @@
     </w:lvl>
   </w:abstractNum>
   <w:num w:numId="1">
+    <w:abstractNumId w:val="3"/>
+  </w:num>
+  <w:num w:numId="2">
+    <w:abstractNumId w:val="1"/>
+  </w:num>
+  <w:num w:numId="3">
     <w:abstractNumId w:val="0"/>
   </w:num>
-  <w:num w:numId="2">
+  <w:num w:numId="4">
     <w:abstractNumId w:val="2"/>
-  </w:num>
-  <w:num w:numId="3">
-    <w:abstractNumId w:val="1"/>
-  </w:num>
-  <w:num w:numId="4">
-    <w:abstractNumId w:val="3"/>
   </w:num>
 </w:numbering>
 </file>

</xml_diff>